<commit_message>
EDA and Problem Statement
</commit_message>
<xml_diff>
--- a/notes.docx
+++ b/notes.docx
@@ -59,6 +59,7 @@
       </w:r>
       <w:r>
         <w:rPr>
+          <w:noProof/>
           <w:sz w:val="24"/>
           <w:szCs w:val="24"/>
         </w:rPr>
@@ -115,6 +116,7 @@
       </w:r>
       <w:r>
         <w:rPr>
+          <w:noProof/>
           <w:sz w:val="24"/>
           <w:szCs w:val="24"/>
         </w:rPr>
@@ -171,6 +173,7 @@
       </w:r>
       <w:r>
         <w:rPr>
+          <w:noProof/>
           <w:sz w:val="24"/>
           <w:szCs w:val="24"/>
         </w:rPr>
@@ -223,8 +226,17 @@
           <w:sz w:val="24"/>
           <w:szCs w:val="24"/>
         </w:rPr>
-        <w:t>Clone repo and sync with github</w:t>
-      </w:r>
+        <w:t xml:space="preserve">Clone repo and sync with </w:t>
+      </w:r>
+      <w:proofErr w:type="spellStart"/>
+      <w:r>
+        <w:rPr>
+          <w:sz w:val="24"/>
+          <w:szCs w:val="24"/>
+        </w:rPr>
+        <w:t>github</w:t>
+      </w:r>
+      <w:proofErr w:type="spellEnd"/>
     </w:p>
     <w:p>
       <w:pPr>
@@ -242,6 +254,7 @@
       </w:r>
       <w:r>
         <w:rPr>
+          <w:noProof/>
           <w:sz w:val="24"/>
           <w:szCs w:val="24"/>
         </w:rPr>
@@ -299,6 +312,7 @@
       </w:r>
       <w:r>
         <w:rPr>
+          <w:noProof/>
           <w:sz w:val="24"/>
           <w:szCs w:val="24"/>
         </w:rPr>
@@ -340,6 +354,7 @@
       </w:r>
       <w:r>
         <w:rPr>
+          <w:noProof/>
           <w:sz w:val="24"/>
           <w:szCs w:val="24"/>
         </w:rPr>
@@ -409,6 +424,7 @@
       </w:r>
       <w:r>
         <w:rPr>
+          <w:noProof/>
           <w:sz w:val="24"/>
           <w:szCs w:val="24"/>
         </w:rPr>
@@ -652,6 +668,494 @@
         </w:rPr>
         <w:t xml:space="preserve"> and this package can be uploaded to PyPi)</w:t>
       </w:r>
+    </w:p>
+    <w:p>
+      <w:pPr>
+        <w:rPr>
+          <w:noProof/>
+        </w:rPr>
+      </w:pPr>
+      <w:r>
+        <w:rPr>
+          <w:noProof/>
+        </w:rPr>
+        <w:t>Create requirerments.txt, create src folder insdie src create __init__.py</w:t>
+      </w:r>
+    </w:p>
+    <w:p>
+      <w:pPr>
+        <w:rPr>
+          <w:noProof/>
+        </w:rPr>
+      </w:pPr>
+      <w:r>
+        <w:rPr>
+          <w:noProof/>
+        </w:rPr>
+        <w:t>Run pip install -r requirements.txt</w:t>
+      </w:r>
+    </w:p>
+    <w:p>
+      <w:pPr>
+        <w:rPr>
+          <w:noProof/>
+        </w:rPr>
+      </w:pPr>
+      <w:r>
+        <w:rPr>
+          <w:noProof/>
+        </w:rPr>
+        <w:t>Commit everything done uptil now</w:t>
+      </w:r>
+      <w:r>
+        <w:rPr>
+          <w:noProof/>
+        </w:rPr>
+        <w:drawing>
+          <wp:inline distT="0" distB="0" distL="0" distR="0" wp14:anchorId="6D651931" wp14:editId="5F57FE73">
+            <wp:extent cx="5731510" cy="1964055"/>
+            <wp:effectExtent l="0" t="0" r="2540" b="0"/>
+            <wp:docPr id="151097552" name="Picture 1"/>
+            <wp:cNvGraphicFramePr>
+              <a:graphicFrameLocks xmlns:a="http://schemas.openxmlformats.org/drawingml/2006/main" noChangeAspect="1"/>
+            </wp:cNvGraphicFramePr>
+            <a:graphic xmlns:a="http://schemas.openxmlformats.org/drawingml/2006/main">
+              <a:graphicData uri="http://schemas.openxmlformats.org/drawingml/2006/picture">
+                <pic:pic xmlns:pic="http://schemas.openxmlformats.org/drawingml/2006/picture">
+                  <pic:nvPicPr>
+                    <pic:cNvPr id="151097552" name=""/>
+                    <pic:cNvPicPr/>
+                  </pic:nvPicPr>
+                  <pic:blipFill rotWithShape="1">
+                    <a:blip r:embed="rId14"/>
+                    <a:srcRect/>
+                    <a:stretch>
+                      <a:fillRect/>
+                    </a:stretch>
+                  </pic:blipFill>
+                  <pic:spPr bwMode="auto">
+                    <a:xfrm>
+                      <a:off x="0" y="0"/>
+                      <a:ext cx="5731510" cy="1964055"/>
+                    </a:xfrm>
+                    <a:prstGeom prst="rect">
+                      <a:avLst/>
+                    </a:prstGeom>
+                    <a:ln>
+                      <a:noFill/>
+                    </a:ln>
+                    <a:extLst>
+                      <a:ext uri="{53640926-AAD7-44D8-BBD7-CCE9431645EC}">
+                        <a14:shadowObscured xmlns:a14="http://schemas.microsoft.com/office/drawing/2010/main"/>
+                      </a:ext>
+                    </a:extLst>
+                  </pic:spPr>
+                </pic:pic>
+              </a:graphicData>
+            </a:graphic>
+          </wp:inline>
+        </w:drawing>
+      </w:r>
+      <w:r>
+        <w:rPr>
+          <w:noProof/>
+        </w:rPr>
+        <w:drawing>
+          <wp:inline distT="0" distB="0" distL="0" distR="0" wp14:anchorId="10A6519D" wp14:editId="2BC5E731">
+            <wp:extent cx="5731510" cy="1190625"/>
+            <wp:effectExtent l="0" t="0" r="2540" b="9525"/>
+            <wp:docPr id="2142103323" name="Picture 1"/>
+            <wp:cNvGraphicFramePr>
+              <a:graphicFrameLocks xmlns:a="http://schemas.openxmlformats.org/drawingml/2006/main" noChangeAspect="1"/>
+            </wp:cNvGraphicFramePr>
+            <a:graphic xmlns:a="http://schemas.openxmlformats.org/drawingml/2006/main">
+              <a:graphicData uri="http://schemas.openxmlformats.org/drawingml/2006/picture">
+                <pic:pic xmlns:pic="http://schemas.openxmlformats.org/drawingml/2006/picture">
+                  <pic:nvPicPr>
+                    <pic:cNvPr id="2142103323" name=""/>
+                    <pic:cNvPicPr/>
+                  </pic:nvPicPr>
+                  <pic:blipFill>
+                    <a:blip r:embed="rId15"/>
+                    <a:stretch>
+                      <a:fillRect/>
+                    </a:stretch>
+                  </pic:blipFill>
+                  <pic:spPr>
+                    <a:xfrm>
+                      <a:off x="0" y="0"/>
+                      <a:ext cx="5731510" cy="1190625"/>
+                    </a:xfrm>
+                    <a:prstGeom prst="rect">
+                      <a:avLst/>
+                    </a:prstGeom>
+                  </pic:spPr>
+                </pic:pic>
+              </a:graphicData>
+            </a:graphic>
+          </wp:inline>
+        </w:drawing>
+      </w:r>
+    </w:p>
+    <w:p>
+      <w:pPr>
+        <w:rPr>
+          <w:noProof/>
+        </w:rPr>
+      </w:pPr>
+    </w:p>
+    <w:p>
+      <w:pPr>
+        <w:rPr>
+          <w:noProof/>
+        </w:rPr>
+      </w:pPr>
+      <w:r>
+        <w:rPr>
+          <w:noProof/>
+        </w:rPr>
+        <w:t>Create components inside src</w:t>
+      </w:r>
+    </w:p>
+    <w:p>
+      <w:pPr>
+        <w:rPr>
+          <w:noProof/>
+        </w:rPr>
+      </w:pPr>
+      <w:r>
+        <w:rPr>
+          <w:noProof/>
+        </w:rPr>
+        <w:lastRenderedPageBreak/>
+        <w:t>Components</w:t>
+      </w:r>
+      <w:r>
+        <w:rPr>
+          <w:noProof/>
+        </w:rPr>
+        <w:t xml:space="preserve"> is created as a package and it can be imported as a package elsewhere. That's why we write __init__.py.</w:t>
+      </w:r>
+      <w:r>
+        <w:rPr>
+          <w:noProof/>
+        </w:rPr>
+        <w:t xml:space="preserve"> Componenets are the modules we are going to create</w:t>
+      </w:r>
+      <w:r>
+        <w:rPr>
+          <w:noProof/>
+        </w:rPr>
+        <w:t>.</w:t>
+      </w:r>
+    </w:p>
+    <w:p>
+      <w:pPr>
+        <w:rPr>
+          <w:noProof/>
+        </w:rPr>
+      </w:pPr>
+      <w:r>
+        <w:rPr>
+          <w:noProof/>
+        </w:rPr>
+        <w:t>Inside components:</w:t>
+      </w:r>
+    </w:p>
+    <w:p>
+      <w:pPr>
+        <w:rPr>
+          <w:noProof/>
+        </w:rPr>
+      </w:pPr>
+      <w:r>
+        <w:rPr>
+          <w:noProof/>
+        </w:rPr>
+        <w:t>-Data_ingestion: all code related to reading the data(here we’ll divide data into train and test, validation data, create different folders etc)</w:t>
+      </w:r>
+    </w:p>
+    <w:p>
+      <w:pPr>
+        <w:rPr>
+          <w:noProof/>
+        </w:rPr>
+      </w:pPr>
+      <w:r>
+        <w:rPr>
+          <w:noProof/>
+        </w:rPr>
+        <w:t>-Data_transformation: any code related to transformation of data( like how to change categorical data to numerical data, how to handle one-hot encoding, label encoding etc)</w:t>
+      </w:r>
+    </w:p>
+    <w:p>
+      <w:pPr>
+        <w:rPr>
+          <w:noProof/>
+        </w:rPr>
+      </w:pPr>
+      <w:r>
+        <w:rPr>
+          <w:noProof/>
+        </w:rPr>
+        <w:t>-model_trainer: here model will be trained</w:t>
+      </w:r>
+    </w:p>
+    <w:p>
+      <w:pPr>
+        <w:rPr>
+          <w:noProof/>
+        </w:rPr>
+      </w:pPr>
+      <w:r>
+        <w:rPr>
+          <w:noProof/>
+        </w:rPr>
+        <w:t>-__init__.py: so that this can be imported</w:t>
+      </w:r>
+    </w:p>
+    <w:p>
+      <w:pPr>
+        <w:rPr>
+          <w:noProof/>
+        </w:rPr>
+      </w:pPr>
+      <w:r>
+        <w:rPr>
+          <w:noProof/>
+        </w:rPr>
+        <w:t>Create 3 more important files inside components:</w:t>
+      </w:r>
+    </w:p>
+    <w:p>
+      <w:pPr>
+        <w:rPr>
+          <w:noProof/>
+        </w:rPr>
+      </w:pPr>
+      <w:r>
+        <w:rPr>
+          <w:noProof/>
+        </w:rPr>
+        <w:t>-logger: for logging</w:t>
+      </w:r>
+    </w:p>
+    <w:p>
+      <w:pPr>
+        <w:rPr>
+          <w:noProof/>
+        </w:rPr>
+      </w:pPr>
+      <w:r>
+        <w:rPr>
+          <w:noProof/>
+        </w:rPr>
+        <w:t>-exception: for exception handling purpose</w:t>
+      </w:r>
+    </w:p>
+    <w:p>
+      <w:pPr>
+        <w:rPr>
+          <w:noProof/>
+        </w:rPr>
+      </w:pPr>
+      <w:r>
+        <w:rPr>
+          <w:noProof/>
+        </w:rPr>
+        <w:t>-utils: any functionalities that we’ll be writing in a common way, which will be used in the entire application(like we can create a mongoDB client here to read a dataset from a database, code to save the model onto cloud)</w:t>
+      </w:r>
+    </w:p>
+    <w:p>
+      <w:pPr>
+        <w:rPr>
+          <w:noProof/>
+        </w:rPr>
+      </w:pPr>
+    </w:p>
+    <w:p>
+      <w:pPr>
+        <w:rPr>
+          <w:noProof/>
+        </w:rPr>
+      </w:pPr>
+      <w:r>
+        <w:rPr>
+          <w:noProof/>
+        </w:rPr>
+        <w:t>Create pipepline folder inside src</w:t>
+      </w:r>
+    </w:p>
+    <w:p>
+      <w:pPr>
+        <w:rPr>
+          <w:noProof/>
+        </w:rPr>
+      </w:pPr>
+      <w:r>
+        <w:rPr>
+          <w:noProof/>
+        </w:rPr>
+        <w:t>Inside pipeline:</w:t>
+      </w:r>
+    </w:p>
+    <w:p>
+      <w:pPr>
+        <w:rPr>
+          <w:noProof/>
+        </w:rPr>
+      </w:pPr>
+      <w:r>
+        <w:rPr>
+          <w:noProof/>
+        </w:rPr>
+        <w:t>-train_pipeline: code for training the pipeline. Form this we’ll trigger/call all the components</w:t>
+      </w:r>
+    </w:p>
+    <w:p>
+      <w:pPr>
+        <w:rPr>
+          <w:noProof/>
+        </w:rPr>
+      </w:pPr>
+      <w:r>
+        <w:rPr>
+          <w:noProof/>
+        </w:rPr>
+        <w:t>-predict_pipeline: to predict for new data after model is created</w:t>
+      </w:r>
+    </w:p>
+    <w:p>
+      <w:pPr>
+        <w:rPr>
+          <w:noProof/>
+        </w:rPr>
+      </w:pPr>
+      <w:r>
+        <w:rPr>
+          <w:noProof/>
+        </w:rPr>
+        <w:t>-__init__.py: so that this can be imported</w:t>
+      </w:r>
+    </w:p>
+    <w:p>
+      <w:pPr>
+        <w:rPr>
+          <w:noProof/>
+        </w:rPr>
+      </w:pPr>
+    </w:p>
+    <w:p>
+      <w:pPr>
+        <w:rPr>
+          <w:noProof/>
+        </w:rPr>
+      </w:pPr>
+      <w:r>
+        <w:rPr>
+          <w:noProof/>
+        </w:rPr>
+        <w:lastRenderedPageBreak/>
+        <w:t>Commit logger and exception</w:t>
+      </w:r>
+      <w:r>
+        <w:rPr>
+          <w:noProof/>
+        </w:rPr>
+        <w:t xml:space="preserve"> and ev</w:t>
+      </w:r>
+      <w:r>
+        <w:rPr>
+          <w:noProof/>
+        </w:rPr>
+        <w:t>e</w:t>
+      </w:r>
+      <w:r>
+        <w:rPr>
+          <w:noProof/>
+        </w:rPr>
+        <w:t>rything else done until now</w:t>
+      </w:r>
+      <w:r>
+        <w:rPr>
+          <w:noProof/>
+        </w:rPr>
+        <w:drawing>
+          <wp:inline distT="0" distB="0" distL="0" distR="0" wp14:anchorId="08769E16" wp14:editId="0DD8DF17">
+            <wp:extent cx="5731510" cy="3022600"/>
+            <wp:effectExtent l="0" t="0" r="2540" b="6350"/>
+            <wp:docPr id="655894358" name="Picture 1"/>
+            <wp:cNvGraphicFramePr>
+              <a:graphicFrameLocks xmlns:a="http://schemas.openxmlformats.org/drawingml/2006/main" noChangeAspect="1"/>
+            </wp:cNvGraphicFramePr>
+            <a:graphic xmlns:a="http://schemas.openxmlformats.org/drawingml/2006/main">
+              <a:graphicData uri="http://schemas.openxmlformats.org/drawingml/2006/picture">
+                <pic:pic xmlns:pic="http://schemas.openxmlformats.org/drawingml/2006/picture">
+                  <pic:nvPicPr>
+                    <pic:cNvPr id="655894358" name=""/>
+                    <pic:cNvPicPr/>
+                  </pic:nvPicPr>
+                  <pic:blipFill>
+                    <a:blip r:embed="rId16"/>
+                    <a:stretch>
+                      <a:fillRect/>
+                    </a:stretch>
+                  </pic:blipFill>
+                  <pic:spPr>
+                    <a:xfrm>
+                      <a:off x="0" y="0"/>
+                      <a:ext cx="5731510" cy="3022600"/>
+                    </a:xfrm>
+                    <a:prstGeom prst="rect">
+                      <a:avLst/>
+                    </a:prstGeom>
+                  </pic:spPr>
+                </pic:pic>
+              </a:graphicData>
+            </a:graphic>
+          </wp:inline>
+        </w:drawing>
+      </w:r>
+    </w:p>
+    <w:p>
+      <w:pPr>
+        <w:rPr>
+          <w:noProof/>
+        </w:rPr>
+      </w:pPr>
+    </w:p>
+    <w:p>
+      <w:pPr>
+        <w:rPr>
+          <w:noProof/>
+        </w:rPr>
+      </w:pPr>
+      <w:r>
+        <w:rPr>
+          <w:noProof/>
+        </w:rPr>
+        <w:t>Create new folder notebook</w:t>
+      </w:r>
+    </w:p>
+    <w:p>
+      <w:pPr>
+        <w:rPr>
+          <w:noProof/>
+        </w:rPr>
+      </w:pPr>
+      <w:r>
+        <w:rPr>
+          <w:noProof/>
+        </w:rPr>
+        <w:t>Install ipynb kernel</w:t>
+      </w:r>
+    </w:p>
+    <w:p>
+      <w:pPr>
+        <w:rPr>
+          <w:noProof/>
+        </w:rPr>
+      </w:pPr>
     </w:p>
     <w:p>
       <w:pPr>

</xml_diff>

<commit_message>
Model Training and Hyperparameter Tuning
</commit_message>
<xml_diff>
--- a/notes.docx
+++ b/notes.docx
@@ -41,7 +41,15 @@
           <w:sz w:val="24"/>
           <w:szCs w:val="24"/>
         </w:rPr>
-        <w:t>rompt after typing code</w:t>
+        <w:t xml:space="preserve">rompt after typing </w:t>
+      </w:r>
+      <w:proofErr w:type="gramStart"/>
+      <w:r>
+        <w:rPr>
+          <w:sz w:val="24"/>
+          <w:szCs w:val="24"/>
+        </w:rPr>
+        <w:t>code</w:t>
       </w:r>
       <w:r>
         <w:rPr>
@@ -55,7 +63,15 @@
           <w:sz w:val="24"/>
           <w:szCs w:val="24"/>
         </w:rPr>
-        <w:t>. in that specific folder, it will open a VS Code instance</w:t>
+        <w:t>.</w:t>
+      </w:r>
+      <w:proofErr w:type="gramEnd"/>
+      <w:r>
+        <w:rPr>
+          <w:sz w:val="24"/>
+          <w:szCs w:val="24"/>
+        </w:rPr>
+        <w:t xml:space="preserve"> in that specific folder, it will open a VS Code instance</w:t>
       </w:r>
       <w:r>
         <w:rPr>
@@ -1226,6 +1242,66 @@
           <w:noProof/>
         </w:rPr>
         <w:t>Work on data transformation file</w:t>
+      </w:r>
+    </w:p>
+    <w:p>
+      <w:pPr>
+        <w:rPr>
+          <w:noProof/>
+        </w:rPr>
+      </w:pPr>
+      <w:r>
+        <w:rPr>
+          <w:noProof/>
+        </w:rPr>
+        <w:t xml:space="preserve">Perform git commit once done with data_ingestion and data_transformation files. Now you’ll have these files under artifacts     </w:t>
+      </w:r>
+    </w:p>
+    <w:p>
+      <w:pPr>
+        <w:rPr>
+          <w:noProof/>
+        </w:rPr>
+      </w:pPr>
+      <w:r>
+        <w:rPr>
+          <w:noProof/>
+        </w:rPr>
+        <w:drawing>
+          <wp:inline distT="0" distB="0" distL="0" distR="0" wp14:anchorId="2DD73038" wp14:editId="5D72D7ED">
+            <wp:extent cx="1983587" cy="1163256"/>
+            <wp:effectExtent l="0" t="0" r="0" b="0"/>
+            <wp:docPr id="1011184484" name="Picture 1"/>
+            <wp:cNvGraphicFramePr>
+              <a:graphicFrameLocks xmlns:a="http://schemas.openxmlformats.org/drawingml/2006/main" noChangeAspect="1"/>
+            </wp:cNvGraphicFramePr>
+            <a:graphic xmlns:a="http://schemas.openxmlformats.org/drawingml/2006/main">
+              <a:graphicData uri="http://schemas.openxmlformats.org/drawingml/2006/picture">
+                <pic:pic xmlns:pic="http://schemas.openxmlformats.org/drawingml/2006/picture">
+                  <pic:nvPicPr>
+                    <pic:cNvPr id="1011184484" name=""/>
+                    <pic:cNvPicPr/>
+                  </pic:nvPicPr>
+                  <pic:blipFill>
+                    <a:blip r:embed="rId17"/>
+                    <a:stretch>
+                      <a:fillRect/>
+                    </a:stretch>
+                  </pic:blipFill>
+                  <pic:spPr>
+                    <a:xfrm>
+                      <a:off x="0" y="0"/>
+                      <a:ext cx="1987306" cy="1165437"/>
+                    </a:xfrm>
+                    <a:prstGeom prst="rect">
+                      <a:avLst/>
+                    </a:prstGeom>
+                  </pic:spPr>
+                </pic:pic>
+              </a:graphicData>
+            </a:graphic>
+          </wp:inline>
+        </w:drawing>
       </w:r>
     </w:p>
     <w:p>
@@ -1909,6 +1985,7 @@
   <w:style w:type="character" w:default="1" w:styleId="DefaultParagraphFont">
     <w:name w:val="Default Paragraph Font"/>
     <w:uiPriority w:val="1"/>
+    <w:semiHidden/>
     <w:unhideWhenUsed/>
   </w:style>
   <w:style w:type="table" w:default="1" w:styleId="TableNormal">

</xml_diff>